<commit_message>
Day13-PromptLogicPlugins: guard core AI call against failure, add project.md
InvokePromptAsync both renders the template (invoking plugin
functions) and calls the model, so a plugin error, bad key, or network
blip would crash the whole program. Wraps it in try/catch. Syncs the
docx's Complete Code listing and replaces missing.md with project.md.
</commit_message>
<xml_diff>
--- a/Day13-PromptLogicPlugins.docx
+++ b/Day13-PromptLogicPlugins.docx
@@ -1572,73 +1572,238 @@
           <w:rFonts w:ascii="Consolas" w:hAnsi="Consolas"/>
           <w:sz w:val="19"/>
         </w:rPr>
-        <w:t xml:space="preserve">            Console.WriteLine($"--- Processing {user.Name} via Built-in Plugins ---");</w:t>
-      </w:r>
-    </w:p>
-    <w:p>
-      <w:pPr>
-        <w:pStyle w:val="NoSpacing"/>
-        <w:rPr>
-          <w:rFonts w:ascii="Consolas" w:hAnsi="Consolas"/>
-          <w:sz w:val="19"/>
-        </w:rPr>
-      </w:pPr>
-    </w:p>
-    <w:p>
-      <w:pPr>
-        <w:pStyle w:val="NoSpacing"/>
-        <w:rPr>
-          <w:rFonts w:ascii="Consolas" w:hAnsi="Consolas"/>
-          <w:sz w:val="19"/>
-        </w:rPr>
-      </w:pPr>
-      <w:r>
-        <w:rPr>
-          <w:rFonts w:ascii="Consolas" w:hAnsi="Consolas"/>
-          <w:sz w:val="19"/>
-        </w:rPr>
-        <w:t xml:space="preserve">            var result = await kernel.InvokePromptAsync(promptTemplate, arguments);</w:t>
-      </w:r>
-    </w:p>
-    <w:p>
-      <w:pPr>
-        <w:pStyle w:val="NoSpacing"/>
-        <w:rPr>
-          <w:rFonts w:ascii="Consolas" w:hAnsi="Consolas"/>
-          <w:sz w:val="19"/>
-        </w:rPr>
-      </w:pPr>
-    </w:p>
-    <w:p>
-      <w:pPr>
-        <w:pStyle w:val="NoSpacing"/>
-        <w:rPr>
-          <w:rFonts w:ascii="Consolas" w:hAnsi="Consolas"/>
-          <w:sz w:val="19"/>
-        </w:rPr>
-      </w:pPr>
-      <w:r>
-        <w:rPr>
-          <w:rFonts w:ascii="Consolas" w:hAnsi="Consolas"/>
-          <w:sz w:val="19"/>
-        </w:rPr>
-        <w:t xml:space="preserve">            Console.WriteLine("\nAI Response:");</w:t>
-      </w:r>
-    </w:p>
-    <w:p>
-      <w:pPr>
-        <w:pStyle w:val="NoSpacing"/>
-        <w:rPr>
-          <w:rFonts w:ascii="Consolas" w:hAnsi="Consolas"/>
-          <w:sz w:val="19"/>
-        </w:rPr>
-      </w:pPr>
-      <w:r>
-        <w:rPr>
-          <w:rFonts w:ascii="Consolas" w:hAnsi="Consolas"/>
-          <w:sz w:val="19"/>
-        </w:rPr>
-        <w:t xml:space="preserve">            Console.WriteLine(result.ToString());</w:t>
+        <w:t xml:space="preserve">            Console.WriteLine($"--- Processing {user.Name} via Built-in Plugins </w:t>
+      </w:r>
+      <w:r>
+        <w:rPr>
+          <w:rFonts w:ascii="Consolas" w:hAnsi="Consolas"/>
+          <w:sz w:val="19"/>
+        </w:rPr>
+        <w:t>---");</w:t>
+      </w:r>
+    </w:p>
+    <w:p>
+      <w:pPr>
+        <w:pStyle w:val="NoSpacing"/>
+        <w:rPr>
+          <w:rFonts w:ascii="Consolas" w:hAnsi="Consolas"/>
+          <w:sz w:val="19"/>
+        </w:rPr>
+      </w:pPr>
+    </w:p>
+    <w:p>
+      <w:pPr>
+        <w:pStyle w:val="NoSpacing"/>
+        <w:rPr>
+          <w:rFonts w:ascii="Consolas" w:hAnsi="Consolas"/>
+          <w:sz w:val="19"/>
+        </w:rPr>
+      </w:pPr>
+      <w:r>
+        <w:rPr>
+          <w:rFonts w:ascii="Consolas" w:hAnsi="Consolas"/>
+          <w:sz w:val="19"/>
+        </w:rPr>
+        <w:t xml:space="preserve">            // Step: Execute the prompt. Wrapped in try/catch - a plugin,</w:t>
+      </w:r>
+    </w:p>
+    <w:p>
+      <w:pPr>
+        <w:pStyle w:val="NoSpacing"/>
+        <w:rPr>
+          <w:rFonts w:ascii="Consolas" w:hAnsi="Consolas"/>
+          <w:sz w:val="19"/>
+        </w:rPr>
+      </w:pPr>
+      <w:r>
+        <w:rPr>
+          <w:rFonts w:ascii="Consolas" w:hAnsi="Consolas"/>
+          <w:sz w:val="19"/>
+        </w:rPr>
+        <w:t xml:space="preserve">            // network, or API error here would otherwise crash the program.</w:t>
+      </w:r>
+    </w:p>
+    <w:p>
+      <w:pPr>
+        <w:pStyle w:val="NoSpacing"/>
+        <w:rPr>
+          <w:rFonts w:ascii="Consolas" w:hAnsi="Consolas"/>
+          <w:sz w:val="19"/>
+        </w:rPr>
+      </w:pPr>
+      <w:r>
+        <w:rPr>
+          <w:rFonts w:ascii="Consolas" w:hAnsi="Consolas"/>
+          <w:sz w:val="19"/>
+        </w:rPr>
+        <w:t xml:space="preserve">            try</w:t>
+      </w:r>
+    </w:p>
+    <w:p>
+      <w:pPr>
+        <w:pStyle w:val="NoSpacing"/>
+        <w:rPr>
+          <w:rFonts w:ascii="Consolas" w:hAnsi="Consolas"/>
+          <w:sz w:val="19"/>
+        </w:rPr>
+      </w:pPr>
+      <w:r>
+        <w:rPr>
+          <w:rFonts w:ascii="Consolas" w:hAnsi="Consolas"/>
+          <w:sz w:val="19"/>
+        </w:rPr>
+        <w:t xml:space="preserve">            {</w:t>
+      </w:r>
+    </w:p>
+    <w:p>
+      <w:pPr>
+        <w:pStyle w:val="NoSpacing"/>
+        <w:rPr>
+          <w:rFonts w:ascii="Consolas" w:hAnsi="Consolas"/>
+          <w:sz w:val="19"/>
+        </w:rPr>
+      </w:pPr>
+      <w:r>
+        <w:rPr>
+          <w:rFonts w:ascii="Consolas" w:hAnsi="Consolas"/>
+          <w:sz w:val="19"/>
+        </w:rPr>
+        <w:t xml:space="preserve">                var result</w:t>
+      </w:r>
+      <w:r>
+        <w:rPr>
+          <w:rFonts w:ascii="Consolas" w:hAnsi="Consolas"/>
+          <w:sz w:val="19"/>
+        </w:rPr>
+        <w:t xml:space="preserve"> = await kernel.InvokePromptAsync(promptTemplate, arguments);</w:t>
+      </w:r>
+    </w:p>
+    <w:p>
+      <w:pPr>
+        <w:pStyle w:val="NoSpacing"/>
+        <w:rPr>
+          <w:rFonts w:ascii="Consolas" w:hAnsi="Consolas"/>
+          <w:sz w:val="19"/>
+        </w:rPr>
+      </w:pPr>
+    </w:p>
+    <w:p>
+      <w:pPr>
+        <w:pStyle w:val="NoSpacing"/>
+        <w:rPr>
+          <w:rFonts w:ascii="Consolas" w:hAnsi="Consolas"/>
+          <w:sz w:val="19"/>
+        </w:rPr>
+      </w:pPr>
+      <w:r>
+        <w:rPr>
+          <w:rFonts w:ascii="Consolas" w:hAnsi="Consolas"/>
+          <w:sz w:val="19"/>
+        </w:rPr>
+        <w:t xml:space="preserve">                Console.WriteLine("\nAI Response:");</w:t>
+      </w:r>
+    </w:p>
+    <w:p>
+      <w:pPr>
+        <w:pStyle w:val="NoSpacing"/>
+        <w:rPr>
+          <w:rFonts w:ascii="Consolas" w:hAnsi="Consolas"/>
+          <w:sz w:val="19"/>
+        </w:rPr>
+      </w:pPr>
+      <w:r>
+        <w:rPr>
+          <w:rFonts w:ascii="Consolas" w:hAnsi="Consolas"/>
+          <w:sz w:val="19"/>
+        </w:rPr>
+        <w:t xml:space="preserve">                </w:t>
+      </w:r>
+      <w:r>
+        <w:rPr>
+          <w:rFonts w:ascii="Consolas" w:hAnsi="Consolas"/>
+          <w:sz w:val="19"/>
+        </w:rPr>
+        <w:t>Console.WriteLine(result.ToString());</w:t>
+      </w:r>
+    </w:p>
+    <w:p>
+      <w:pPr>
+        <w:pStyle w:val="NoSpacing"/>
+        <w:rPr>
+          <w:rFonts w:ascii="Consolas" w:hAnsi="Consolas"/>
+          <w:sz w:val="19"/>
+        </w:rPr>
+      </w:pPr>
+      <w:r>
+        <w:rPr>
+          <w:rFonts w:ascii="Consolas" w:hAnsi="Consolas"/>
+          <w:sz w:val="19"/>
+        </w:rPr>
+        <w:t xml:space="preserve">            }</w:t>
+      </w:r>
+    </w:p>
+    <w:p>
+      <w:pPr>
+        <w:pStyle w:val="NoSpacing"/>
+        <w:rPr>
+          <w:rFonts w:ascii="Consolas" w:hAnsi="Consolas"/>
+          <w:sz w:val="19"/>
+        </w:rPr>
+      </w:pPr>
+      <w:r>
+        <w:rPr>
+          <w:rFonts w:ascii="Consolas" w:hAnsi="Consolas"/>
+          <w:sz w:val="19"/>
+        </w:rPr>
+        <w:t xml:space="preserve">            catch (Exception ex)</w:t>
+      </w:r>
+    </w:p>
+    <w:p>
+      <w:pPr>
+        <w:pStyle w:val="NoSpacing"/>
+        <w:rPr>
+          <w:rFonts w:ascii="Consolas" w:hAnsi="Consolas"/>
+          <w:sz w:val="19"/>
+        </w:rPr>
+      </w:pPr>
+      <w:r>
+        <w:rPr>
+          <w:rFonts w:ascii="Consolas" w:hAnsi="Consolas"/>
+          <w:sz w:val="19"/>
+        </w:rPr>
+        <w:t xml:space="preserve">            {</w:t>
+      </w:r>
+    </w:p>
+    <w:p>
+      <w:pPr>
+        <w:pStyle w:val="NoSpacing"/>
+        <w:rPr>
+          <w:rFonts w:ascii="Consolas" w:hAnsi="Consolas"/>
+          <w:sz w:val="19"/>
+        </w:rPr>
+      </w:pPr>
+      <w:r>
+        <w:rPr>
+          <w:rFonts w:ascii="Consolas" w:hAnsi="Consolas"/>
+          <w:sz w:val="19"/>
+        </w:rPr>
+        <w:t xml:space="preserve">                Console.WriteLine($"Request failed: {ex.Message}");</w:t>
+      </w:r>
+    </w:p>
+    <w:p>
+      <w:pPr>
+        <w:pStyle w:val="NoSpacing"/>
+        <w:rPr>
+          <w:rFonts w:ascii="Consolas" w:hAnsi="Consolas"/>
+          <w:sz w:val="19"/>
+        </w:rPr>
+      </w:pPr>
+      <w:r>
+        <w:rPr>
+          <w:rFonts w:ascii="Consolas" w:hAnsi="Consolas"/>
+          <w:sz w:val="19"/>
+        </w:rPr>
+        <w:t xml:space="preserve">            }</w:t>
       </w:r>
     </w:p>
     <w:p>
@@ -1718,63 +1883,56 @@
         <w:t>Step 2: The Plugin as a "Logic Layer."</w:t>
       </w:r>
       <w:r>
-        <w:t xml:space="preserve"> `UserHelperPlugin` contains two methods. `GetPurchaseList` implements what would otherwise be a template `{{#each}}`-style </w:t>
-      </w:r>
-      <w:r>
+        <w:t xml:space="preserve"> `UserHelperPlugin` contains two methods. `GetPurchaseList` implements what would otherwise be a template `{{#each}}`-style loop: it checks whether the purchase list is null/empty and, if not, uses LINQ's `Select` + `string.Join` to format each purchase into a `"- Name ($Price)"` line. `GetTierInstructions` implements what would otherwise be a template `{{#if}}` conditional: a simple case-insensitive string comparison choosing between two canned instruction strings. Both methods are ordinary, unit-testable C# — you could write an xUnit test against `GetTierInstructions("Gold")` without touching the Kernel at all.</w:t>
+      </w:r>
+    </w:p>
+    <w:p/>
+    <w:p>
+      <w:r>
+        <w:rPr>
+          <w:b/>
+        </w:rPr>
+        <w:t>Step 3: The [KernelFunction] and [Description] Attributes.</w:t>
+      </w:r>
+      <w:r>
+        <w:t xml:space="preserve"> Marking a method `[KernelFunction]` is what makes it visible to Semantic Kernel's prompt template engine and to automatic function-calling in later lessons — without this attribute, the template's `{{UserHelperPlugin.GetPurchaseList $user}}` syntax would have nothing to resolve to. `[Description]` documents what the function does; while not strictly required for the direct template-call syntax used here, it becomes essential later when a model has to decide *which* function to call on its own (Days covering planning/auto function-calling), so this lesson plants that attribute early as good habit.</w:t>
+      </w:r>
+    </w:p>
+    <w:p/>
+    <w:p>
+      <w:r>
+        <w:rPr>
+          <w:b/>
+        </w:rPr>
+        <w:t>Step 4: Registering the Plugin on the Builder.</w:t>
+      </w:r>
+      <w:r>
+        <w:t xml:space="preserve"> `builder.Plugins.AddFromType&lt;UserHelperPlugin&gt;()` uses reflection to scan `UserHelperPlugin` for `[KernelFunction]`-decorated methods and registers them as a named plugin (by default, named after the class: `UserHelperPlugin`) on the Kernel being built. This one line is what makes the dotted `UserHelperPlugin.GetTierInstructions` syntax in the template resolvable at render time.</w:t>
+      </w:r>
+    </w:p>
+    <w:p/>
+    <w:p>
+      <w:r>
+        <w:rPr>
+          <w:b/>
+        </w:rPr>
+        <w:t>Step 5: Calling Functions Directly From the Template.</w:t>
+      </w:r>
+      <w:r>
+        <w:t xml:space="preserve"> This is the heart of the lesson. Semantic Kernel's prompt template language supports `{{PluginName.FunctionName $argumentVariable}}` syntax, which — at render time — looks up the named function, invokes it with the given `KernelArguments` variable as its parameter, and splices the function's return value into the rendered prompt text in place of that expression. `{{UserHelperPlugin.GetTierInstructions $tier}}` and `{{UserHelperPlugin.GetPurchaseList $user}}` both resolve this way before the completed prompt is ever sent to the model.</w:t>
+      </w:r>
+    </w:p>
+    <w:p/>
+    <w:p>
+      <w:r>
+        <w:rPr>
+          <w:b/>
+        </w:rPr>
         <w:lastRenderedPageBreak/>
-        <w:t>loop: it checks whether the purchase list is null/empty and, if not, uses LINQ's `Select` + `string.Join` to format each purchase into a `"- Name ($Price)"` line. `GetTierInstructions` implements what would otherwise be a template `{{#if}}` conditional: a simple case-insensitive string comparison choosing between two canned instruction strings. Both methods are ordinary, unit-testable C# — you could write an xUnit test against `GetTierInstructions("Gold")` without touching the Kernel at all.</w:t>
-      </w:r>
-    </w:p>
-    <w:p/>
-    <w:p>
-      <w:r>
-        <w:rPr>
-          <w:b/>
-        </w:rPr>
-        <w:t>Step 3: The [KernelFunction] and [Description] Attributes.</w:t>
-      </w:r>
-      <w:r>
-        <w:t xml:space="preserve"> Marking a method `[KernelFunction]` is what makes it visible to Semantic Kernel's prompt template engine and to automatic function-calling in later lessons — without this attribute, the template's `{{UserHelperPlugin.GetPurchaseList $user}}` syntax would have nothing to resolve to. `[Description]` documents what the function does; while not strictly required for the direct template-call syntax used here, it becomes essential later when a model has to decide *which* function to call on its own (Days covering planning/auto function-calling), so this lesson plants that attribute early as good habit.</w:t>
-      </w:r>
-    </w:p>
-    <w:p/>
-    <w:p>
-      <w:r>
-        <w:rPr>
-          <w:b/>
-        </w:rPr>
-        <w:t>Step 4: Registering the Plugin on the Builder.</w:t>
-      </w:r>
-      <w:r>
-        <w:t xml:space="preserve"> `builder.Plugins.AddFromType&lt;UserHelperPlugin&gt;()` uses reflection to scan `UserHelperPlugin` for `[KernelFunction]`-decorated methods and registers them as a named plugin (by default, named after the class: `UserHelperPlugin`) on the Kernel being built. This one line is what makes the dotted `UserHelperPlugin.GetTierInstructions` syntax in the template resolvable at render time.</w:t>
-      </w:r>
-    </w:p>
-    <w:p/>
-    <w:p>
-      <w:r>
-        <w:rPr>
-          <w:b/>
-        </w:rPr>
-        <w:t>Step 5: Calling Functions Directly From the Template.</w:t>
-      </w:r>
-      <w:r>
-        <w:t xml:space="preserve"> This is the heart of the lesson. Semantic Kernel's prompt template language supports `{{PluginName.FunctionName $argumentVariable}}` syntax, which — at render time — looks up the named function, invokes it with the given `KernelArguments` variable as its parameter, and splices the function's return value into the rendered prompt text in place of that expression. `{{UserHelperPlugin.GetTierInstructions $tier}}` and `{{UserHelperPlugin.GetPurchaseList $user}}` both resolve this way before the completed prompt is ever sent to the model.</w:t>
-      </w:r>
-    </w:p>
-    <w:p/>
-    <w:p>
-      <w:r>
-        <w:rPr>
-          <w:b/>
-        </w:rPr>
         <w:t>Step 6: Passing a Whole Object as an Argument.</w:t>
       </w:r>
       <w:r>
-        <w:t xml:space="preserve"> Notice that `arguments["user"] = user` stores a full `UserProfile` record — not a string — and the template passes it as `$user` directly into `GetPurchaseList(UserProfile user)`. The template engine matches the </w:t>
-      </w:r>
-      <w:r>
-        <w:lastRenderedPageBreak/>
-        <w:t>argument to the function's declared parameter type at invocation time; you don't have to serialize the object into text yourself, unlike `$name` and `$tier`, which are plain strings meant for direct display in the rendered prompt.</w:t>
+        <w:t xml:space="preserve"> Notice that `arguments["user"] = user` stores a full `UserProfile` record — not a string — and the template passes it as `$user` directly into `GetPurchaseList(UserProfile user)`. The template engine matches the argument to the function's declared parameter type at invocation time; you don't have to serialize the object into text yourself, unlike `$name` and `$tier`, which are plain strings meant for direct display in the rendered prompt.</w:t>
       </w:r>
     </w:p>
     <w:p/>

</xml_diff>